<commit_message>
Add consolidated governance plan (single Word deliverable)
- build/generate_plan.py assembles 00-plan-de-gouvernance.docx/.pdf from the
  existing .md sources: cover, auto TOC, executive summary, 4 parts, org chart
  image (exported from the pptx), compliance checklist and sources as annexes
- generate_docx: TOC support, built-in style constants (localized style names)
- build_all runs the plan step; README/CLAUDE.md list the 2 files to submit

Co-Authored-By: Claude Opus 5 (1M context) <noreply@anthropic.com>
Claude-Session: https://claude.ai/code/session_015uANx7cAHFE1tmh9NRb8KT
</commit_message>
<xml_diff>
--- a/livrables/01-data-maturity-assessment.docx
+++ b/livrables/01-data-maturity-assessment.docx
@@ -195,12 +195,12 @@
         <w:tblLook w:val="0020" w:firstRow="1" w:lastRow="0" w:firstColumn="0" w:lastColumn="0" w:noHBand="0" w:noVBand="0"/>
       </w:tblPr>
       <w:tblGrid>
-        <w:gridCol w:w="1486"/>
-        <w:gridCol w:w="530"/>
-        <w:gridCol w:w="530"/>
-        <w:gridCol w:w="2335"/>
-        <w:gridCol w:w="2972"/>
-        <w:gridCol w:w="2335"/>
+        <w:gridCol w:w="1425"/>
+        <w:gridCol w:w="713"/>
+        <w:gridCol w:w="713"/>
+        <w:gridCol w:w="2242"/>
+        <w:gridCol w:w="2853"/>
+        <w:gridCol w:w="2242"/>
       </w:tblGrid>
       <w:tr>
         <w:trPr>
@@ -209,7 +209,7 @@
         </w:trPr>
         <w:tc>
           <w:tcPr>
-            <w:tcW w:w="1155" w:type="dxa"/>
+            <w:tcW w:w="1108" w:type="dxa"/>
             <w:tcBorders>
               <w:bottom w:val="none" w:sz="0" w:space="0" w:color="auto"/>
             </w:tcBorders>
@@ -235,7 +235,7 @@
         </w:tc>
         <w:tc>
           <w:tcPr>
-            <w:tcW w:w="412" w:type="dxa"/>
+            <w:tcW w:w="554" w:type="dxa"/>
             <w:tcBorders>
               <w:bottom w:val="none" w:sz="0" w:space="0" w:color="auto"/>
             </w:tcBorders>
@@ -262,7 +262,7 @@
         </w:tc>
         <w:tc>
           <w:tcPr>
-            <w:tcW w:w="412" w:type="dxa"/>
+            <w:tcW w:w="554" w:type="dxa"/>
             <w:tcBorders>
               <w:bottom w:val="none" w:sz="0" w:space="0" w:color="auto"/>
             </w:tcBorders>
@@ -289,7 +289,7 @@
         </w:tc>
         <w:tc>
           <w:tcPr>
-            <w:tcW w:w="1815" w:type="dxa"/>
+            <w:tcW w:w="1742" w:type="dxa"/>
             <w:tcBorders>
               <w:bottom w:val="none" w:sz="0" w:space="0" w:color="auto"/>
             </w:tcBorders>
@@ -315,7 +315,7 @@
         </w:tc>
         <w:tc>
           <w:tcPr>
-            <w:tcW w:w="2310" w:type="dxa"/>
+            <w:tcW w:w="2217" w:type="dxa"/>
             <w:tcBorders>
               <w:bottom w:val="none" w:sz="0" w:space="0" w:color="auto"/>
             </w:tcBorders>
@@ -341,7 +341,7 @@
         </w:tc>
         <w:tc>
           <w:tcPr>
-            <w:tcW w:w="1815" w:type="dxa"/>
+            <w:tcW w:w="1742" w:type="dxa"/>
             <w:tcBorders>
               <w:bottom w:val="none" w:sz="0" w:space="0" w:color="auto"/>
             </w:tcBorders>
@@ -369,7 +369,7 @@
       <w:tr>
         <w:tc>
           <w:tcPr>
-            <w:tcW w:w="1155" w:type="dxa"/>
+            <w:tcW w:w="1108" w:type="dxa"/>
             <w:shd w:val="clear" w:color="auto" w:fill="auto"/>
           </w:tcPr>
           <w:p>
@@ -392,7 +392,7 @@
         </w:tc>
         <w:tc>
           <w:tcPr>
-            <w:tcW w:w="412" w:type="dxa"/>
+            <w:tcW w:w="554" w:type="dxa"/>
             <w:shd w:val="clear" w:color="auto" w:fill="auto"/>
           </w:tcPr>
           <w:p>
@@ -416,7 +416,7 @@
         </w:tc>
         <w:tc>
           <w:tcPr>
-            <w:tcW w:w="412" w:type="dxa"/>
+            <w:tcW w:w="554" w:type="dxa"/>
             <w:shd w:val="clear" w:color="auto" w:fill="auto"/>
           </w:tcPr>
           <w:p>
@@ -438,7 +438,7 @@
         </w:tc>
         <w:tc>
           <w:tcPr>
-            <w:tcW w:w="1815" w:type="dxa"/>
+            <w:tcW w:w="1742" w:type="dxa"/>
             <w:shd w:val="clear" w:color="auto" w:fill="auto"/>
           </w:tcPr>
           <w:p>
@@ -459,7 +459,7 @@
         </w:tc>
         <w:tc>
           <w:tcPr>
-            <w:tcW w:w="2310" w:type="dxa"/>
+            <w:tcW w:w="2217" w:type="dxa"/>
             <w:shd w:val="clear" w:color="auto" w:fill="auto"/>
           </w:tcPr>
           <w:p>
@@ -480,7 +480,7 @@
         </w:tc>
         <w:tc>
           <w:tcPr>
-            <w:tcW w:w="1815" w:type="dxa"/>
+            <w:tcW w:w="1742" w:type="dxa"/>
             <w:shd w:val="clear" w:color="auto" w:fill="auto"/>
           </w:tcPr>
           <w:p>
@@ -503,7 +503,7 @@
       <w:tr>
         <w:tc>
           <w:tcPr>
-            <w:tcW w:w="1155" w:type="dxa"/>
+            <w:tcW w:w="1108" w:type="dxa"/>
             <w:shd w:val="clear" w:color="auto" w:fill="auto"/>
           </w:tcPr>
           <w:p>
@@ -526,7 +526,7 @@
         </w:tc>
         <w:tc>
           <w:tcPr>
-            <w:tcW w:w="412" w:type="dxa"/>
+            <w:tcW w:w="554" w:type="dxa"/>
             <w:shd w:val="clear" w:color="auto" w:fill="auto"/>
           </w:tcPr>
           <w:p>
@@ -548,7 +548,7 @@
         </w:tc>
         <w:tc>
           <w:tcPr>
-            <w:tcW w:w="412" w:type="dxa"/>
+            <w:tcW w:w="554" w:type="dxa"/>
             <w:shd w:val="clear" w:color="auto" w:fill="auto"/>
           </w:tcPr>
           <w:p>
@@ -570,7 +570,7 @@
         </w:tc>
         <w:tc>
           <w:tcPr>
-            <w:tcW w:w="1815" w:type="dxa"/>
+            <w:tcW w:w="1742" w:type="dxa"/>
             <w:shd w:val="clear" w:color="auto" w:fill="auto"/>
           </w:tcPr>
           <w:p>
@@ -597,7 +597,7 @@
         </w:tc>
         <w:tc>
           <w:tcPr>
-            <w:tcW w:w="2310" w:type="dxa"/>
+            <w:tcW w:w="2217" w:type="dxa"/>
             <w:shd w:val="clear" w:color="auto" w:fill="auto"/>
           </w:tcPr>
           <w:p>
@@ -618,7 +618,7 @@
         </w:tc>
         <w:tc>
           <w:tcPr>
-            <w:tcW w:w="1815" w:type="dxa"/>
+            <w:tcW w:w="1742" w:type="dxa"/>
             <w:shd w:val="clear" w:color="auto" w:fill="auto"/>
           </w:tcPr>
           <w:p>
@@ -641,7 +641,7 @@
       <w:tr>
         <w:tc>
           <w:tcPr>
-            <w:tcW w:w="1155" w:type="dxa"/>
+            <w:tcW w:w="1108" w:type="dxa"/>
             <w:shd w:val="clear" w:color="auto" w:fill="auto"/>
           </w:tcPr>
           <w:p>
@@ -672,7 +672,7 @@
         </w:tc>
         <w:tc>
           <w:tcPr>
-            <w:tcW w:w="412" w:type="dxa"/>
+            <w:tcW w:w="554" w:type="dxa"/>
             <w:shd w:val="clear" w:color="auto" w:fill="auto"/>
           </w:tcPr>
           <w:p>
@@ -694,7 +694,7 @@
         </w:tc>
         <w:tc>
           <w:tcPr>
-            <w:tcW w:w="412" w:type="dxa"/>
+            <w:tcW w:w="554" w:type="dxa"/>
             <w:shd w:val="clear" w:color="auto" w:fill="auto"/>
           </w:tcPr>
           <w:p>
@@ -716,7 +716,7 @@
         </w:tc>
         <w:tc>
           <w:tcPr>
-            <w:tcW w:w="1815" w:type="dxa"/>
+            <w:tcW w:w="1742" w:type="dxa"/>
             <w:shd w:val="clear" w:color="auto" w:fill="auto"/>
           </w:tcPr>
           <w:p>
@@ -737,7 +737,7 @@
         </w:tc>
         <w:tc>
           <w:tcPr>
-            <w:tcW w:w="2310" w:type="dxa"/>
+            <w:tcW w:w="2217" w:type="dxa"/>
             <w:shd w:val="clear" w:color="auto" w:fill="auto"/>
           </w:tcPr>
           <w:p>
@@ -758,7 +758,7 @@
         </w:tc>
         <w:tc>
           <w:tcPr>
-            <w:tcW w:w="1815" w:type="dxa"/>
+            <w:tcW w:w="1742" w:type="dxa"/>
             <w:shd w:val="clear" w:color="auto" w:fill="auto"/>
           </w:tcPr>
           <w:p>
@@ -781,7 +781,7 @@
       <w:tr>
         <w:tc>
           <w:tcPr>
-            <w:tcW w:w="1155" w:type="dxa"/>
+            <w:tcW w:w="1108" w:type="dxa"/>
             <w:shd w:val="clear" w:color="auto" w:fill="auto"/>
           </w:tcPr>
           <w:p>
@@ -804,7 +804,7 @@
         </w:tc>
         <w:tc>
           <w:tcPr>
-            <w:tcW w:w="412" w:type="dxa"/>
+            <w:tcW w:w="554" w:type="dxa"/>
             <w:shd w:val="clear" w:color="auto" w:fill="auto"/>
           </w:tcPr>
           <w:p>
@@ -826,7 +826,7 @@
         </w:tc>
         <w:tc>
           <w:tcPr>
-            <w:tcW w:w="412" w:type="dxa"/>
+            <w:tcW w:w="554" w:type="dxa"/>
             <w:shd w:val="clear" w:color="auto" w:fill="auto"/>
           </w:tcPr>
           <w:p>
@@ -848,7 +848,7 @@
         </w:tc>
         <w:tc>
           <w:tcPr>
-            <w:tcW w:w="1815" w:type="dxa"/>
+            <w:tcW w:w="1742" w:type="dxa"/>
             <w:shd w:val="clear" w:color="auto" w:fill="auto"/>
           </w:tcPr>
           <w:p>
@@ -869,7 +869,7 @@
         </w:tc>
         <w:tc>
           <w:tcPr>
-            <w:tcW w:w="2310" w:type="dxa"/>
+            <w:tcW w:w="2217" w:type="dxa"/>
             <w:shd w:val="clear" w:color="auto" w:fill="auto"/>
           </w:tcPr>
           <w:p>
@@ -890,7 +890,7 @@
         </w:tc>
         <w:tc>
           <w:tcPr>
-            <w:tcW w:w="1815" w:type="dxa"/>
+            <w:tcW w:w="1742" w:type="dxa"/>
             <w:shd w:val="clear" w:color="auto" w:fill="auto"/>
           </w:tcPr>
           <w:p>
@@ -913,7 +913,7 @@
       <w:tr>
         <w:tc>
           <w:tcPr>
-            <w:tcW w:w="1155" w:type="dxa"/>
+            <w:tcW w:w="1108" w:type="dxa"/>
             <w:shd w:val="clear" w:color="auto" w:fill="auto"/>
           </w:tcPr>
           <w:p>
@@ -936,7 +936,7 @@
         </w:tc>
         <w:tc>
           <w:tcPr>
-            <w:tcW w:w="412" w:type="dxa"/>
+            <w:tcW w:w="554" w:type="dxa"/>
             <w:shd w:val="clear" w:color="auto" w:fill="auto"/>
           </w:tcPr>
           <w:p>
@@ -958,7 +958,7 @@
         </w:tc>
         <w:tc>
           <w:tcPr>
-            <w:tcW w:w="412" w:type="dxa"/>
+            <w:tcW w:w="554" w:type="dxa"/>
             <w:shd w:val="clear" w:color="auto" w:fill="auto"/>
           </w:tcPr>
           <w:p>
@@ -980,7 +980,7 @@
         </w:tc>
         <w:tc>
           <w:tcPr>
-            <w:tcW w:w="1815" w:type="dxa"/>
+            <w:tcW w:w="1742" w:type="dxa"/>
             <w:shd w:val="clear" w:color="auto" w:fill="auto"/>
           </w:tcPr>
           <w:p>
@@ -1001,7 +1001,7 @@
         </w:tc>
         <w:tc>
           <w:tcPr>
-            <w:tcW w:w="2310" w:type="dxa"/>
+            <w:tcW w:w="2217" w:type="dxa"/>
             <w:shd w:val="clear" w:color="auto" w:fill="auto"/>
           </w:tcPr>
           <w:p>
@@ -1022,7 +1022,7 @@
         </w:tc>
         <w:tc>
           <w:tcPr>
-            <w:tcW w:w="1815" w:type="dxa"/>
+            <w:tcW w:w="1742" w:type="dxa"/>
             <w:shd w:val="clear" w:color="auto" w:fill="auto"/>
           </w:tcPr>
           <w:p>
@@ -1045,7 +1045,7 @@
       <w:tr>
         <w:tc>
           <w:tcPr>
-            <w:tcW w:w="1155" w:type="dxa"/>
+            <w:tcW w:w="1108" w:type="dxa"/>
             <w:shd w:val="clear" w:color="auto" w:fill="auto"/>
           </w:tcPr>
           <w:p>
@@ -1076,7 +1076,7 @@
         </w:tc>
         <w:tc>
           <w:tcPr>
-            <w:tcW w:w="412" w:type="dxa"/>
+            <w:tcW w:w="554" w:type="dxa"/>
             <w:shd w:val="clear" w:color="auto" w:fill="auto"/>
           </w:tcPr>
           <w:p>
@@ -1098,7 +1098,7 @@
         </w:tc>
         <w:tc>
           <w:tcPr>
-            <w:tcW w:w="412" w:type="dxa"/>
+            <w:tcW w:w="554" w:type="dxa"/>
             <w:shd w:val="clear" w:color="auto" w:fill="auto"/>
           </w:tcPr>
           <w:p>
@@ -1120,7 +1120,7 @@
         </w:tc>
         <w:tc>
           <w:tcPr>
-            <w:tcW w:w="1815" w:type="dxa"/>
+            <w:tcW w:w="1742" w:type="dxa"/>
             <w:shd w:val="clear" w:color="auto" w:fill="auto"/>
           </w:tcPr>
           <w:p>
@@ -1141,7 +1141,7 @@
         </w:tc>
         <w:tc>
           <w:tcPr>
-            <w:tcW w:w="2310" w:type="dxa"/>
+            <w:tcW w:w="2217" w:type="dxa"/>
             <w:shd w:val="clear" w:color="auto" w:fill="auto"/>
           </w:tcPr>
           <w:p>
@@ -1162,7 +1162,7 @@
         </w:tc>
         <w:tc>
           <w:tcPr>
-            <w:tcW w:w="1815" w:type="dxa"/>
+            <w:tcW w:w="1742" w:type="dxa"/>
             <w:shd w:val="clear" w:color="auto" w:fill="auto"/>
           </w:tcPr>
           <w:p>
@@ -1185,7 +1185,7 @@
       <w:tr>
         <w:tc>
           <w:tcPr>
-            <w:tcW w:w="1155" w:type="dxa"/>
+            <w:tcW w:w="1108" w:type="dxa"/>
             <w:shd w:val="clear" w:color="auto" w:fill="auto"/>
           </w:tcPr>
           <w:p>
@@ -1208,7 +1208,7 @@
         </w:tc>
         <w:tc>
           <w:tcPr>
-            <w:tcW w:w="412" w:type="dxa"/>
+            <w:tcW w:w="554" w:type="dxa"/>
             <w:shd w:val="clear" w:color="auto" w:fill="auto"/>
           </w:tcPr>
           <w:p>
@@ -1230,7 +1230,7 @@
         </w:tc>
         <w:tc>
           <w:tcPr>
-            <w:tcW w:w="412" w:type="dxa"/>
+            <w:tcW w:w="554" w:type="dxa"/>
             <w:shd w:val="clear" w:color="auto" w:fill="auto"/>
           </w:tcPr>
           <w:p>
@@ -1252,7 +1252,7 @@
         </w:tc>
         <w:tc>
           <w:tcPr>
-            <w:tcW w:w="1815" w:type="dxa"/>
+            <w:tcW w:w="1742" w:type="dxa"/>
             <w:shd w:val="clear" w:color="auto" w:fill="auto"/>
           </w:tcPr>
           <w:p>
@@ -1273,7 +1273,7 @@
         </w:tc>
         <w:tc>
           <w:tcPr>
-            <w:tcW w:w="2310" w:type="dxa"/>
+            <w:tcW w:w="2217" w:type="dxa"/>
             <w:shd w:val="clear" w:color="auto" w:fill="auto"/>
           </w:tcPr>
           <w:p>
@@ -1294,7 +1294,7 @@
         </w:tc>
         <w:tc>
           <w:tcPr>
-            <w:tcW w:w="1815" w:type="dxa"/>
+            <w:tcW w:w="1742" w:type="dxa"/>
             <w:shd w:val="clear" w:color="auto" w:fill="auto"/>
           </w:tcPr>
           <w:p>
@@ -1317,7 +1317,7 @@
       <w:tr>
         <w:tc>
           <w:tcPr>
-            <w:tcW w:w="1155" w:type="dxa"/>
+            <w:tcW w:w="1108" w:type="dxa"/>
             <w:shd w:val="clear" w:color="auto" w:fill="auto"/>
           </w:tcPr>
           <w:p>
@@ -1340,7 +1340,7 @@
         </w:tc>
         <w:tc>
           <w:tcPr>
-            <w:tcW w:w="412" w:type="dxa"/>
+            <w:tcW w:w="554" w:type="dxa"/>
             <w:shd w:val="clear" w:color="auto" w:fill="auto"/>
           </w:tcPr>
           <w:p>
@@ -1362,7 +1362,7 @@
         </w:tc>
         <w:tc>
           <w:tcPr>
-            <w:tcW w:w="412" w:type="dxa"/>
+            <w:tcW w:w="554" w:type="dxa"/>
             <w:shd w:val="clear" w:color="auto" w:fill="auto"/>
           </w:tcPr>
           <w:p>
@@ -1384,7 +1384,7 @@
         </w:tc>
         <w:tc>
           <w:tcPr>
-            <w:tcW w:w="1815" w:type="dxa"/>
+            <w:tcW w:w="1742" w:type="dxa"/>
             <w:shd w:val="clear" w:color="auto" w:fill="auto"/>
           </w:tcPr>
           <w:p>
@@ -1405,7 +1405,7 @@
         </w:tc>
         <w:tc>
           <w:tcPr>
-            <w:tcW w:w="2310" w:type="dxa"/>
+            <w:tcW w:w="2217" w:type="dxa"/>
             <w:shd w:val="clear" w:color="auto" w:fill="auto"/>
           </w:tcPr>
           <w:p>
@@ -1432,7 +1432,7 @@
         </w:tc>
         <w:tc>
           <w:tcPr>
-            <w:tcW w:w="1815" w:type="dxa"/>
+            <w:tcW w:w="1742" w:type="dxa"/>
             <w:shd w:val="clear" w:color="auto" w:fill="auto"/>
           </w:tcPr>
           <w:p>
@@ -1455,7 +1455,7 @@
       <w:tr>
         <w:tc>
           <w:tcPr>
-            <w:tcW w:w="1155" w:type="dxa"/>
+            <w:tcW w:w="1108" w:type="dxa"/>
             <w:shd w:val="clear" w:color="auto" w:fill="auto"/>
           </w:tcPr>
           <w:p>
@@ -1478,7 +1478,7 @@
         </w:tc>
         <w:tc>
           <w:tcPr>
-            <w:tcW w:w="412" w:type="dxa"/>
+            <w:tcW w:w="554" w:type="dxa"/>
             <w:shd w:val="clear" w:color="auto" w:fill="auto"/>
           </w:tcPr>
           <w:p>
@@ -1500,7 +1500,7 @@
         </w:tc>
         <w:tc>
           <w:tcPr>
-            <w:tcW w:w="412" w:type="dxa"/>
+            <w:tcW w:w="554" w:type="dxa"/>
             <w:shd w:val="clear" w:color="auto" w:fill="auto"/>
           </w:tcPr>
           <w:p>
@@ -1522,7 +1522,7 @@
         </w:tc>
         <w:tc>
           <w:tcPr>
-            <w:tcW w:w="1815" w:type="dxa"/>
+            <w:tcW w:w="1742" w:type="dxa"/>
             <w:shd w:val="clear" w:color="auto" w:fill="auto"/>
           </w:tcPr>
           <w:p>
@@ -1543,7 +1543,7 @@
         </w:tc>
         <w:tc>
           <w:tcPr>
-            <w:tcW w:w="2310" w:type="dxa"/>
+            <w:tcW w:w="2217" w:type="dxa"/>
             <w:shd w:val="clear" w:color="auto" w:fill="auto"/>
           </w:tcPr>
           <w:p>
@@ -1564,7 +1564,7 @@
         </w:tc>
         <w:tc>
           <w:tcPr>
-            <w:tcW w:w="1815" w:type="dxa"/>
+            <w:tcW w:w="1742" w:type="dxa"/>
             <w:shd w:val="clear" w:color="auto" w:fill="auto"/>
           </w:tcPr>
           <w:p>
@@ -2075,7 +2075,7 @@
   <w:abstractNum w:abstractNumId="0" w15:restartNumberingAfterBreak="0">
     <w:nsid w:val="0000A990"/>
     <w:multiLevelType w:val="multilevel"/>
-    <w:tmpl w:val="868E8B06"/>
+    <w:tmpl w:val="8EDE7920"/>
     <w:lvl w:ilvl="0">
       <w:numFmt w:val="bullet"/>
       <w:lvlText w:val=" "/>
@@ -2516,13 +2516,14 @@
     <w:pPr>
       <w:keepNext/>
       <w:keepLines/>
-      <w:spacing w:before="360"/>
+      <w:spacing w:before="160" w:after="60"/>
       <w:outlineLvl w:val="0"/>
     </w:pPr>
     <w:rPr>
-      <w:rFonts w:asciiTheme="majorHAnsi" w:eastAsiaTheme="majorEastAsia" w:hAnsiTheme="majorHAnsi" w:cstheme="majorBidi"/>
-      <w:color w:val="0F4761" w:themeColor="accent1" w:themeShade="BF"/>
-      <w:sz w:val="40"/>
+      <w:rFonts w:eastAsiaTheme="majorEastAsia"/>
+      <w:b/>
+      <w:color w:val="1DB954"/>
+      <w:sz w:val="32"/>
       <w:szCs w:val="40"/>
     </w:rPr>
   </w:style>
@@ -2539,13 +2540,14 @@
     <w:pPr>
       <w:keepNext/>
       <w:keepLines/>
-      <w:spacing w:before="160"/>
+      <w:spacing w:before="160" w:after="60"/>
       <w:outlineLvl w:val="1"/>
     </w:pPr>
     <w:rPr>
-      <w:rFonts w:asciiTheme="majorHAnsi" w:eastAsiaTheme="majorEastAsia" w:hAnsiTheme="majorHAnsi" w:cstheme="majorBidi"/>
-      <w:color w:val="0F4761" w:themeColor="accent1" w:themeShade="BF"/>
-      <w:sz w:val="32"/>
+      <w:rFonts w:eastAsiaTheme="majorEastAsia"/>
+      <w:b/>
+      <w:color w:val="191414"/>
+      <w:sz w:val="24"/>
       <w:szCs w:val="32"/>
     </w:rPr>
   </w:style>
@@ -2562,13 +2564,14 @@
     <w:pPr>
       <w:keepNext/>
       <w:keepLines/>
-      <w:spacing w:before="160"/>
+      <w:spacing w:before="160" w:after="60"/>
       <w:outlineLvl w:val="2"/>
     </w:pPr>
     <w:rPr>
-      <w:rFonts w:eastAsiaTheme="majorEastAsia" w:cstheme="majorBidi"/>
-      <w:color w:val="0F4761" w:themeColor="accent1" w:themeShade="BF"/>
-      <w:sz w:val="28"/>
+      <w:rFonts w:eastAsiaTheme="majorEastAsia"/>
+      <w:b/>
+      <w:color w:val="191414"/>
+      <w:sz w:val="22"/>
       <w:szCs w:val="28"/>
     </w:rPr>
   </w:style>
@@ -2762,12 +2765,15 @@
     <w:qFormat/>
     <w:rsid w:val="00A10FD9"/>
     <w:pPr>
+      <w:spacing w:after="60"/>
       <w:contextualSpacing/>
       <w:jc w:val="center"/>
     </w:pPr>
     <w:rPr>
-      <w:rFonts w:asciiTheme="majorHAnsi" w:eastAsiaTheme="majorEastAsia" w:hAnsiTheme="majorHAnsi" w:cstheme="majorBidi"/>
-      <w:sz w:val="56"/>
+      <w:rFonts w:eastAsiaTheme="majorEastAsia"/>
+      <w:b/>
+      <w:color w:val="1DB954"/>
+      <w:sz w:val="40"/>
       <w:szCs w:val="56"/>
     </w:rPr>
   </w:style>
@@ -2778,8 +2784,10 @@
     <w:uiPriority w:val="10"/>
     <w:rsid w:val="00A10FD9"/>
     <w:rPr>
-      <w:rFonts w:asciiTheme="majorHAnsi" w:eastAsiaTheme="majorEastAsia" w:hAnsiTheme="majorHAnsi" w:cstheme="majorBidi"/>
-      <w:sz w:val="56"/>
+      <w:rFonts w:ascii="Calibri" w:eastAsiaTheme="majorEastAsia" w:hAnsi="Calibri" w:cs="Calibri"/>
+      <w:b/>
+      <w:color w:val="1DB954"/>
+      <w:sz w:val="40"/>
       <w:szCs w:val="56"/>
     </w:rPr>
   </w:style>
@@ -2797,8 +2805,9 @@
       </w:numPr>
     </w:pPr>
     <w:rPr>
+      <w:color w:val="8A8A8A"/>
       <w:spacing w:val="15"/>
-      <w:sz w:val="28"/>
+      <w:sz w:val="24"/>
       <w:szCs w:val="28"/>
     </w:rPr>
   </w:style>
@@ -2809,10 +2818,10 @@
     <w:uiPriority w:val="11"/>
     <w:rsid w:val="00A10FD9"/>
     <w:rPr>
-      <w:rFonts w:eastAsiaTheme="majorEastAsia" w:cstheme="majorBidi"/>
-      <w:color w:val="595959" w:themeColor="text1" w:themeTint="A6"/>
+      <w:rFonts w:ascii="Calibri" w:eastAsiaTheme="majorEastAsia" w:hAnsi="Calibri" w:cs="Calibri"/>
+      <w:b/>
+      <w:color w:val="8A8A8A"/>
       <w:spacing w:val="15"/>
-      <w:sz w:val="28"/>
       <w:szCs w:val="28"/>
     </w:rPr>
   </w:style>
@@ -2890,9 +2899,10 @@
     <w:uiPriority w:val="9"/>
     <w:rsid w:val="00A10FD9"/>
     <w:rPr>
-      <w:rFonts w:asciiTheme="majorHAnsi" w:eastAsiaTheme="majorEastAsia" w:hAnsiTheme="majorHAnsi" w:cstheme="majorBidi"/>
-      <w:color w:val="0F4761" w:themeColor="accent1" w:themeShade="BF"/>
-      <w:sz w:val="40"/>
+      <w:rFonts w:ascii="Calibri" w:eastAsiaTheme="majorEastAsia" w:hAnsi="Calibri" w:cs="Calibri"/>
+      <w:b/>
+      <w:color w:val="1DB954"/>
+      <w:sz w:val="32"/>
       <w:szCs w:val="40"/>
     </w:rPr>
   </w:style>
@@ -2904,9 +2914,9 @@
     <w:semiHidden/>
     <w:rsid w:val="00A10FD9"/>
     <w:rPr>
-      <w:rFonts w:asciiTheme="majorHAnsi" w:eastAsiaTheme="majorEastAsia" w:hAnsiTheme="majorHAnsi" w:cstheme="majorBidi"/>
-      <w:color w:val="0F4761" w:themeColor="accent1" w:themeShade="BF"/>
-      <w:sz w:val="32"/>
+      <w:rFonts w:ascii="Calibri" w:eastAsiaTheme="majorEastAsia" w:hAnsi="Calibri" w:cs="Calibri"/>
+      <w:b/>
+      <w:color w:val="191414"/>
       <w:szCs w:val="32"/>
     </w:rPr>
   </w:style>
@@ -2918,9 +2928,10 @@
     <w:semiHidden/>
     <w:rsid w:val="00A10FD9"/>
     <w:rPr>
-      <w:rFonts w:eastAsiaTheme="majorEastAsia" w:cstheme="majorBidi"/>
-      <w:color w:val="0F4761" w:themeColor="accent1" w:themeShade="BF"/>
-      <w:sz w:val="28"/>
+      <w:rFonts w:ascii="Calibri" w:eastAsiaTheme="majorEastAsia" w:hAnsi="Calibri" w:cs="Calibri"/>
+      <w:b/>
+      <w:color w:val="191414"/>
+      <w:sz w:val="22"/>
       <w:szCs w:val="28"/>
     </w:rPr>
   </w:style>
@@ -3150,6 +3161,10 @@
       <w:spacing w:before="240" w:line="259" w:lineRule="auto"/>
       <w:outlineLvl w:val="9"/>
     </w:pPr>
+    <w:rPr>
+      <w:rFonts w:asciiTheme="majorHAnsi" w:hAnsiTheme="majorHAnsi" w:cstheme="majorBidi"/>
+      <w:color w:val="0F4761" w:themeColor="accent1" w:themeShade="BF"/>
+    </w:rPr>
   </w:style>
   <w:style w:type="paragraph" w:customStyle="1" w:styleId="SourceCode">
     <w:name w:val="Source Code"/>
@@ -3455,7 +3470,7 @@
     <w:basedOn w:val="Normal"/>
     <w:link w:val="En-tteCar"/>
     <w:unhideWhenUsed/>
-    <w:rsid w:val="006505A9"/>
+    <w:rsid w:val="00275E7E"/>
     <w:pPr>
       <w:tabs>
         <w:tab w:val="center" w:pos="4536"/>
@@ -3468,7 +3483,7 @@
     <w:name w:val="En-tête Car"/>
     <w:basedOn w:val="Policepardfaut"/>
     <w:link w:val="En-tte"/>
-    <w:rsid w:val="006505A9"/>
+    <w:rsid w:val="00275E7E"/>
     <w:rPr>
       <w:rFonts w:ascii="Calibri" w:hAnsi="Calibri" w:cs="Calibri"/>
       <w:sz w:val="20"/>
@@ -3479,7 +3494,7 @@
     <w:basedOn w:val="Normal"/>
     <w:link w:val="PieddepageCar"/>
     <w:unhideWhenUsed/>
-    <w:rsid w:val="006505A9"/>
+    <w:rsid w:val="00275E7E"/>
     <w:pPr>
       <w:tabs>
         <w:tab w:val="center" w:pos="4536"/>
@@ -3492,7 +3507,7 @@
     <w:name w:val="Pied de page Car"/>
     <w:basedOn w:val="Policepardfaut"/>
     <w:link w:val="Pieddepage"/>
-    <w:rsid w:val="006505A9"/>
+    <w:rsid w:val="00275E7E"/>
     <w:rPr>
       <w:rFonts w:ascii="Calibri" w:hAnsi="Calibri" w:cs="Calibri"/>
       <w:sz w:val="20"/>

</xml_diff>